<commit_message>
content: blueprint upgrade to 15 methods (2026 update: AI short drama, agent services, vibe coding, AI music, export stickers)
</commit_message>
<xml_diff>
--- a/AI-Money-Blueprint.docx
+++ b/AI-Money-Blueprint.docx
@@ -34,7 +34,7 @@
           <w:sz w:val="32"/>
           <w:szCs w:val="32"/>
         </w:rPr>
-        <w:t xml:space="preserve">10 Proven Ways to Earn Online with AI in 2026</w:t>
+        <w:t>15 Proven Ways to Earn Online with AI in 2026</w:t>
       </w:r>
     </w:p>
     <w:p>
@@ -148,7 +148,7 @@
           <w:sz w:val="22"/>
           <w:szCs w:val="22"/>
         </w:rPr>
-        <w:t xml:space="preserve">This guide covers 10 proven methods, from beginner-friendly to advanced, each with specific tools, step-by-step instructions, and realistic income projections. Whether you want to earn an extra $500/month or build a full-time income, there's a method here for you.</w:t>
+        <w:t>This guide covers 15 proven methods, from beginner-friendly to advanced, including five new 2026 methods, each with specific tools, step-by-step instructions, and realistic income projections. Whether you want to earn an extra $500/month or build a full-time income, there's a method here for you.</w:t>
       </w:r>
     </w:p>
     <w:p>
@@ -2651,6 +2651,152 @@
       </w:pPr>
       <w:r>
         <w:t xml:space="preserve">Resources &amp; Links</w:t>
+      </w:r>
+    </w:p>
+    <w:p>
+      <w:r>
+        <w:t>2026 Update (August): five new methods, verified against current market data.</w:t>
+      </w:r>
+    </w:p>
+    <w:p/>
+    <w:p>
+      <w:pPr>
+        <w:pStyle w:val="Heading1"/>
+        <w:spacing w:after="200" w:before="400"/>
+      </w:pPr>
+      <w:r>
+        <w:t>Method 11: AI Short-Drama &amp; Micro-Series Production</w:t>
+      </w:r>
+    </w:p>
+    <w:p>
+      <w:r>
+        <w:t>AI-generated short dramas are the fastest-growing content lane in 2026: over 95% of new micro-dramas are now AI-produced. Short, high-retention episodes are distributed on YouTube Shorts, TikTok, and dedicated micro-drama platforms, with revenue from platform rewards, ad share, and licensing to overseas distributors.</w:t>
+      </w:r>
+    </w:p>
+    <w:p>
+      <w:r>
+        <w:t>Tools: Seedance, Kling AI, Vidu, Runway (video); ElevenLabs (voice); Suno (music); CapCut or JianYing (editing).</w:t>
+      </w:r>
+    </w:p>
+    <w:p>
+      <w:r>
+        <w:t>Step-by-step: pick a niche with strong retention (romance, thriller, business, history) - write a 60-90 second script with a hook in the first 3 seconds - generate scenes with AI video - add voiceover and music - edit to platform specs - publish consistently and track which hooks convert.</w:t>
+      </w:r>
+    </w:p>
+    <w:p>
+      <w:r>
+        <w:t>Realistic income: $100-3,000/month starting out. It behaves like any content business: consistent output beats one-off virality.</w:t>
+      </w:r>
+    </w:p>
+    <w:p>
+      <w:pPr>
+        <w:pStyle w:val="Heading1"/>
+        <w:spacing w:after="200" w:before="400"/>
+      </w:pPr>
+      <w:r>
+        <w:t>Method 12: AI Agent Deployment &amp; Digital Employee Services</w:t>
+      </w:r>
+    </w:p>
+    <w:p>
+      <w:r>
+        <w:t>Businesses know they should use AI agents but don't know how to install or operate them. That gap is a service business: deploy agents (OpenClaw, Dify, Coze, n8n) for clients and charge setup plus monthly retainer.</w:t>
+      </w:r>
+    </w:p>
+    <w:p>
+      <w:r>
+        <w:t>Tools: OpenClaw, Dify, Coze, n8n, Gumloop, MuleRun.</w:t>
+      </w:r>
+    </w:p>
+    <w:p>
+      <w:r>
+        <w:t>Step-by-step: pick one workflow a business repeats daily (support, invoicing, reporting) - build a focused agent that does just that - show a demo with real numbers (hours saved) - charge a setup fee plus a monthly maintenance retainer - expand into more workflows over time.</w:t>
+      </w:r>
+    </w:p>
+    <w:p>
+      <w:r>
+        <w:t>Realistic income: $500-5,000/month. A solo deployer in 2026 went from $150 per install to $2,000/day once he started teaching clients how to actually use the agent - installation is the entry, usefulness is the product.</w:t>
+      </w:r>
+    </w:p>
+    <w:p>
+      <w:pPr>
+        <w:pStyle w:val="Heading1"/>
+        <w:spacing w:after="200" w:before="400"/>
+      </w:pPr>
+      <w:r>
+        <w:t>Method 13: Vibe-Coded Mini Apps</w:t>
+      </w:r>
+    </w:p>
+    <w:p>
+      <w:r>
+        <w:t>You no longer need to write code to build software. Describe a small app in plain language to an AI builder, iterate, and ship. Small utility apps sell on app stores, marketplaces, and to clients who need a tiny internal tool.</w:t>
+      </w:r>
+    </w:p>
+    <w:p>
+      <w:r>
+        <w:t>Tools: Cursor, Bolt, Lovable, Windsurf, Claude, GPT.</w:t>
+      </w:r>
+    </w:p>
+    <w:p>
+      <w:r>
+        <w:t>Step-by-step: find one tiny annoying problem people have - describe the app in plain language - iterate with AI until it works - publish on an app store or sell directly - collect feedback and improve. In 2026 a 'kitten flashlight' utility app, built in about an hour, hit #1 on a paid app chart within 4 hours.</w:t>
+      </w:r>
+    </w:p>
+    <w:p>
+      <w:r>
+        <w:t>Realistic income: $100-5,000 per app. Not every app sells; the ones that solve a specific, felt problem do.</w:t>
+      </w:r>
+    </w:p>
+    <w:p>
+      <w:pPr>
+        <w:pStyle w:val="Heading1"/>
+        <w:spacing w:after="200" w:before="400"/>
+      </w:pPr>
+      <w:r>
+        <w:t>Method 14: AI Music &amp; Audio Production</w:t>
+      </w:r>
+    </w:p>
+    <w:p>
+      <w:r>
+        <w:t>AI music generation (Suno, Udio) plus realistic AI voices (ElevenLabs) lets anyone produce usable audio: background music, jingles, podcast intros, audiobook narration, and video soundtracks.</w:t>
+      </w:r>
+    </w:p>
+    <w:p>
+      <w:r>
+        <w:t>Step-by-step: produce a catalog of royalty-free tracks - sell licenses on music marketplaces - offer custom jingles and intros to local businesses and creators - add audiobook or podcast production as a higher-ticket service.</w:t>
+      </w:r>
+    </w:p>
+    <w:p>
+      <w:r>
+        <w:t>Realistic income: $100-2,000/month. Small repeat clients (podcasters, YouTubers, small businesses) are the steady base.</w:t>
+      </w:r>
+    </w:p>
+    <w:p>
+      <w:pPr>
+        <w:pStyle w:val="Heading1"/>
+        <w:spacing w:after="200" w:before="400"/>
+      </w:pPr>
+      <w:r>
+        <w:t>Method 15: AI Stickers &amp; Digital Products for Export</w:t>
+      </w:r>
+    </w:p>
+    <w:p>
+      <w:r>
+        <w:t>AI image tools make sticker packs, emoji sets, and digital art cheap to produce - and the export market pays in stronger currencies. Sticker packs designed with AI have produced five-figure monthly income for creators selling overseas.</w:t>
+      </w:r>
+    </w:p>
+    <w:p>
+      <w:r>
+        <w:t>Tools: Midjourney, GPT-Image, Jimeng, Canva.</w:t>
+      </w:r>
+    </w:p>
+    <w:p>
+      <w:r>
+        <w:t>Step-by-step: design a themed pack (10-30 pieces) - publish on sticker platforms and marketplaces (LINE, Etsy, WeChat, Xianyu) - localize themes for target markets - study top performers and double down on the style that sells.</w:t>
+      </w:r>
+    </w:p>
+    <w:p>
+      <w:r>
+        <w:t>Realistic income: $100-3,000/month. Volume plus iteration beats one perfect pack.</w:t>
       </w:r>
     </w:p>
     <w:p>

</xml_diff>